<commit_message>
docs: correct model evaluation evidence scoring
</commit_message>
<xml_diff>
--- a/docs/reports/vibe-coding-model-comparison-evaluation-report.docx
+++ b/docs/reports/vibe-coding-model-comparison-evaluation-report.docx
@@ -4745,7 +4745,7 @@
                 <w:b w:val="0"/>
                 <w:sz w:val="17"/>
               </w:rPr>
-              <w:t>Pass — playable build is evidenced by the recorded gameplay checks</w:t>
+              <w:t>Not measured — startup evidence was not recorded</w:t>
             </w:r>
           </w:p>
         </w:tc>
@@ -5685,7 +5685,7 @@
                 <w:b w:val="0"/>
                 <w:sz w:val="16"/>
               </w:rPr>
-              <w:t>Open-weight correspondence</w:t>
+              <w:t>Alias lifecycle / service status</w:t>
             </w:r>
           </w:p>
         </w:tc>
@@ -5705,7 +5705,7 @@
                 <w:b w:val="0"/>
                 <w:sz w:val="16"/>
               </w:rPr>
-              <w:t>deepseek-ai/DeepSeek-V4-Flash</w:t>
+              <w:t>Public beta; deepseek-v4-flash points to the latest version, not a fixed snapshot</w:t>
             </w:r>
           </w:p>
         </w:tc>
@@ -5725,7 +5725,7 @@
                 <w:b w:val="0"/>
                 <w:sz w:val="16"/>
               </w:rPr>
-              <w:t>Qwen/Qwen3.5-35B-A3B</w:t>
+              <w:t>qwen3.5-flash currently maps to the 2026-02-23 capability snapshot; freeze the dated ID per run</w:t>
             </w:r>
           </w:p>
         </w:tc>
@@ -5751,7 +5751,7 @@
                 <w:b w:val="0"/>
                 <w:sz w:val="16"/>
               </w:rPr>
-              <w:t>Architecture / parameters</w:t>
+              <w:t>Open-weight correspondence</w:t>
             </w:r>
           </w:p>
         </w:tc>
@@ -5772,7 +5772,7 @@
                 <w:b w:val="0"/>
                 <w:sz w:val="16"/>
               </w:rPr>
-              <w:t>MoE; 284B total / 13B activated</w:t>
+              <w:t>deepseek-ai/DeepSeek-V4-Flash</w:t>
             </w:r>
           </w:p>
         </w:tc>
@@ -5793,7 +5793,7 @@
                 <w:b w:val="0"/>
                 <w:sz w:val="16"/>
               </w:rPr>
-              <w:t>Hybrid Gated DeltaNet + sparse MoE; 35B total / 3B activated</w:t>
+              <w:t>Qwen/Qwen3.5-35B-A3B</w:t>
             </w:r>
           </w:p>
         </w:tc>
@@ -5819,7 +5819,7 @@
                 <w:b w:val="0"/>
                 <w:sz w:val="16"/>
               </w:rPr>
-              <w:t>Open-weight licence</w:t>
+              <w:t>Architecture / parameters</w:t>
             </w:r>
           </w:p>
         </w:tc>
@@ -5840,7 +5840,7 @@
                 <w:b w:val="0"/>
                 <w:sz w:val="16"/>
               </w:rPr>
-              <w:t>MIT</w:t>
+              <w:t>MoE; 284B total / 13B activated</w:t>
             </w:r>
           </w:p>
         </w:tc>
@@ -5861,7 +5861,7 @@
                 <w:b w:val="0"/>
                 <w:sz w:val="16"/>
               </w:rPr>
-              <w:t>Apache-2.0</w:t>
+              <w:t>Hybrid Gated DeltaNet + sparse MoE; 35B total / 3B activated</w:t>
             </w:r>
           </w:p>
         </w:tc>
@@ -5887,7 +5887,7 @@
                 <w:b w:val="0"/>
                 <w:sz w:val="16"/>
               </w:rPr>
-              <w:t>Modalities</w:t>
+              <w:t>Open-weight licence</w:t>
             </w:r>
           </w:p>
         </w:tc>
@@ -5908,7 +5908,7 @@
                 <w:b w:val="0"/>
                 <w:sz w:val="16"/>
               </w:rPr>
-              <w:t>Text generation</w:t>
+              <w:t>MIT</w:t>
             </w:r>
           </w:p>
         </w:tc>
@@ -5929,7 +5929,7 @@
                 <w:b w:val="0"/>
                 <w:sz w:val="16"/>
               </w:rPr>
-              <w:t>Hosted vision-language model; text, image/video understanding</w:t>
+              <w:t>Apache-2.0</w:t>
             </w:r>
           </w:p>
         </w:tc>
@@ -5954,7 +5954,7 @@
                 <w:b w:val="0"/>
                 <w:sz w:val="16"/>
               </w:rPr>
-              <w:t>Context window</w:t>
+              <w:t>Modalities</w:t>
             </w:r>
           </w:p>
         </w:tc>
@@ -5974,7 +5974,7 @@
                 <w:b w:val="0"/>
                 <w:sz w:val="16"/>
               </w:rPr>
-              <w:t>1,000,000 tokens</w:t>
+              <w:t>Text generation</w:t>
             </w:r>
           </w:p>
         </w:tc>
@@ -5994,7 +5994,7 @@
                 <w:b w:val="0"/>
                 <w:sz w:val="16"/>
               </w:rPr>
-              <w:t>1,000,000 tokens hosted; open weights 262,144 native, extensible to 1,010,000</w:t>
+              <w:t>Hosted vision-language model; text, image/video understanding</w:t>
             </w:r>
           </w:p>
         </w:tc>
@@ -6019,7 +6019,7 @@
                 <w:b w:val="0"/>
                 <w:sz w:val="16"/>
               </w:rPr>
-              <w:t>Maximum output</w:t>
+              <w:t>Context window</w:t>
             </w:r>
           </w:p>
         </w:tc>
@@ -6039,7 +6039,7 @@
                 <w:b w:val="0"/>
                 <w:sz w:val="16"/>
               </w:rPr>
-              <w:t>384,000 tokens</w:t>
+              <w:t>1,000,000 tokens</w:t>
             </w:r>
           </w:p>
         </w:tc>
@@ -6059,7 +6059,7 @@
                 <w:b w:val="0"/>
                 <w:sz w:val="16"/>
               </w:rPr>
-              <w:t>65,536 tokens</w:t>
+              <w:t>1,000,000 tokens hosted; open weights 262,144 native, extensible to 1,010,000</w:t>
             </w:r>
           </w:p>
         </w:tc>
@@ -6084,7 +6084,7 @@
                 <w:b w:val="0"/>
                 <w:sz w:val="16"/>
               </w:rPr>
-              <w:t>Reasoning / tools</w:t>
+              <w:t>Maximum output</w:t>
             </w:r>
           </w:p>
         </w:tc>
@@ -6104,7 +6104,7 @@
                 <w:b w:val="0"/>
                 <w:sz w:val="16"/>
               </w:rPr>
-              <w:t>Non-thinking and thinking; JSON, tool calls, Responses and Anthropic APIs</w:t>
+              <w:t>384,000 tokens</w:t>
             </w:r>
           </w:p>
         </w:tc>
@@ -6124,7 +6124,7 @@
                 <w:b w:val="0"/>
                 <w:sz w:val="16"/>
               </w:rPr>
-              <w:t>Thinking/non-thinking; official built-in tools and function calling</w:t>
+              <w:t>65,536 tokens</w:t>
             </w:r>
           </w:p>
         </w:tc>
@@ -6146,7 +6146,7 @@
                 <w:b w:val="0"/>
                 <w:sz w:val="16"/>
               </w:rPr>
-              <w:t>Native API input price</w:t>
+              <w:t>Reasoning / tools</w:t>
             </w:r>
           </w:p>
         </w:tc>
@@ -6166,7 +6166,7 @@
                 <w:b w:val="0"/>
                 <w:sz w:val="16"/>
               </w:rPr>
-              <w:t>US$0.22/M off-peak; US$0.44/M peak</w:t>
+              <w:t>Non-thinking and thinking; JSON, tool calls, Responses and Anthropic APIs</w:t>
             </w:r>
           </w:p>
         </w:tc>
@@ -6186,7 +6186,7 @@
                 <w:b w:val="0"/>
                 <w:sz w:val="16"/>
               </w:rPr>
-              <w:t>International: US$0.10/M (official CN page: RMB 0.734). China: RMB 0.2 / 0.8 / 1.2 for ≤128K / ≤256K / ≤1M</w:t>
+              <w:t>Thinking/non-thinking; official built-in tools and function calling</w:t>
             </w:r>
           </w:p>
         </w:tc>
@@ -6208,7 +6208,7 @@
                 <w:b w:val="0"/>
                 <w:sz w:val="16"/>
               </w:rPr>
-              <w:t>Native API output price</w:t>
+              <w:t>Native API input price</w:t>
             </w:r>
           </w:p>
         </w:tc>
@@ -6228,7 +6228,7 @@
                 <w:b w:val="0"/>
                 <w:sz w:val="16"/>
               </w:rPr>
-              <w:t>US$0.66/M off-peak; US$1.32/M peak</w:t>
+              <w:t>US$0.22/M off-peak; US$0.44/M peak</w:t>
             </w:r>
           </w:p>
         </w:tc>
@@ -6248,7 +6248,7 @@
                 <w:b w:val="0"/>
                 <w:sz w:val="16"/>
               </w:rPr>
-              <w:t>International: US$0.40/M (official CN page: RMB 2.936). China: RMB 2 / 8 / 12 for ≤128K / ≤256K / ≤1M</w:t>
+              <w:t>International: US$0.10/M (official CN page: RMB 0.734). China: RMB 0.2 / 0.8 / 1.2 for ≤128K / ≤256K / ≤1M</w:t>
             </w:r>
           </w:p>
         </w:tc>
@@ -6270,7 +6270,7 @@
                 <w:b w:val="0"/>
                 <w:sz w:val="16"/>
               </w:rPr>
-              <w:t>Native cached-input price</w:t>
+              <w:t>Native API output price</w:t>
             </w:r>
           </w:p>
         </w:tc>
@@ -6290,7 +6290,7 @@
                 <w:b w:val="0"/>
                 <w:sz w:val="16"/>
               </w:rPr>
-              <w:t>US$0.007/M off-peak; US$0.014/M peak</w:t>
+              <w:t>US$0.66/M off-peak; US$1.32/M peak</w:t>
             </w:r>
           </w:p>
         </w:tc>
@@ -6310,7 +6310,7 @@
                 <w:b w:val="0"/>
                 <w:sz w:val="16"/>
               </w:rPr>
-              <w:t>Explicit cache hit: 10% of input rate; create: 125%. Implicit hit: 20%; create: 100%</w:t>
+              <w:t>International: US$0.40/M (official CN page: RMB 2.936). China: RMB 2 / 8 / 12 for ≤128K / ≤256K / ≤1M</w:t>
             </w:r>
           </w:p>
         </w:tc>
@@ -6332,7 +6332,7 @@
                 <w:b w:val="0"/>
                 <w:sz w:val="16"/>
               </w:rPr>
-              <w:t>Batch / cache conditions</w:t>
+              <w:t>Native cached-input price</w:t>
             </w:r>
           </w:p>
         </w:tc>
@@ -6352,7 +6352,7 @@
                 <w:b w:val="0"/>
                 <w:sz w:val="16"/>
               </w:rPr>
-              <w:t>Automatic cache-hit pricing; no batch discount stated on the cited price page</w:t>
+              <w:t>US$0.007/M off-peak; US$0.014/M peak</w:t>
             </w:r>
           </w:p>
         </w:tc>
@@ -6372,7 +6372,7 @@
                 <w:b w:val="0"/>
                 <w:sz w:val="16"/>
               </w:rPr>
-              <w:t>Batch API: 50% of standard price. Explicit and implicit cache are mutually exclusive</w:t>
+              <w:t>Explicit cache hit: 10% of input rate; create: 125%. Implicit hit: 20%; create: 100%</w:t>
             </w:r>
           </w:p>
         </w:tc>
@@ -6394,7 +6394,7 @@
                 <w:b w:val="0"/>
                 <w:sz w:val="16"/>
               </w:rPr>
-              <w:t>Native concurrency / rate evidence</w:t>
+              <w:t>Batch / cache conditions</w:t>
             </w:r>
           </w:p>
         </w:tc>
@@ -6414,7 +6414,7 @@
                 <w:b w:val="0"/>
                 <w:sz w:val="16"/>
               </w:rPr>
-              <w:t>2,500 concurrent requests</w:t>
+              <w:t>Automatic cache-hit pricing; no batch discount stated on the cited price page</w:t>
             </w:r>
           </w:p>
         </w:tc>
@@ -6434,7 +6434,7 @@
                 <w:b w:val="0"/>
                 <w:sz w:val="16"/>
               </w:rPr>
-              <w:t>Beijing: 30,000 RPM / 10M TPM; international: 600 RPM / 1M TPM</w:t>
+              <w:t>Batch API: 50% of standard price. Explicit and implicit cache are mutually exclusive</w:t>
             </w:r>
           </w:p>
         </w:tc>
@@ -6456,7 +6456,7 @@
                 <w:b w:val="0"/>
                 <w:sz w:val="16"/>
               </w:rPr>
-              <w:t>Official SWE-bench Verified</w:t>
+              <w:t>Native concurrency / rate evidence</w:t>
             </w:r>
           </w:p>
         </w:tc>
@@ -6476,7 +6476,7 @@
                 <w:b w:val="0"/>
                 <w:sz w:val="16"/>
               </w:rPr>
-              <w:t>78.6 (Flash High)</w:t>
+              <w:t>2,500 concurrent requests</w:t>
             </w:r>
           </w:p>
         </w:tc>
@@ -6496,7 +6496,7 @@
                 <w:b w:val="0"/>
                 <w:sz w:val="16"/>
               </w:rPr>
-              <w:t>69.2 (Qwen3.5-35B-A3B model card)</w:t>
+              <w:t>Beijing: 30,000 RPM / 10M TPM; international: 600 RPM / 1M TPM</w:t>
             </w:r>
           </w:p>
         </w:tc>
@@ -6518,7 +6518,7 @@
                 <w:b w:val="0"/>
                 <w:sz w:val="16"/>
               </w:rPr>
-              <w:t>Official Terminal Bench 2</w:t>
+              <w:t>Official Terminal-Bench 2.1</w:t>
             </w:r>
           </w:p>
         </w:tc>
@@ -6538,7 +6538,7 @@
                 <w:b w:val="0"/>
                 <w:sz w:val="16"/>
               </w:rPr>
-              <w:t>56.6 (Flash High)</w:t>
+              <w:t>82.7 (0731, max effort; publisher harness)</w:t>
             </w:r>
           </w:p>
         </w:tc>
@@ -6558,7 +6558,7 @@
                 <w:b w:val="0"/>
                 <w:sz w:val="16"/>
               </w:rPr>
-              <w:t>40.5 (Qwen3.5-35B-A3B model card)</w:t>
+              <w:t>40.5 (Qwen3.5-35B-A3B model card; method may differ)</w:t>
             </w:r>
           </w:p>
         </w:tc>
@@ -6580,7 +6580,7 @@
                 <w:b w:val="0"/>
                 <w:sz w:val="16"/>
               </w:rPr>
-              <w:t>Official LiveCodeBench</w:t>
+              <w:t>Official SWE-bench Verified</w:t>
             </w:r>
           </w:p>
         </w:tc>
@@ -6600,7 +6600,7 @@
                 <w:b w:val="0"/>
                 <w:sz w:val="16"/>
               </w:rPr>
-              <w:t>88.4 pass@1 (Flash High)</w:t>
+              <w:t>Not retained in the current 0731 evidence pack</w:t>
             </w:r>
           </w:p>
         </w:tc>
@@ -6620,7 +6620,7 @@
                 <w:b w:val="0"/>
                 <w:sz w:val="16"/>
               </w:rPr>
-              <w:t>74.6 (LiveCodeBench v6, Qwen3.5-35B-A3B model card)</w:t>
+              <w:t>69.2 (Qwen3.5-35B-A3B model card)</w:t>
             </w:r>
           </w:p>
         </w:tc>
@@ -6642,7 +6642,7 @@
                 <w:b w:val="0"/>
                 <w:sz w:val="16"/>
               </w:rPr>
-              <w:t>Official FullStackBench EN</w:t>
+              <w:t>Official LiveCodeBench</w:t>
             </w:r>
           </w:p>
         </w:tc>
@@ -6662,7 +6662,7 @@
                 <w:b w:val="0"/>
                 <w:sz w:val="16"/>
               </w:rPr>
-              <w:t>Not published in the cited DeepSeek matrix</w:t>
+              <w:t>Not retained in the current 0731 evidence pack</w:t>
             </w:r>
           </w:p>
         </w:tc>
@@ -6682,7 +6682,317 @@
                 <w:b w:val="0"/>
                 <w:sz w:val="16"/>
               </w:rPr>
+              <w:t>74.6 (LiveCodeBench v6, Qwen3.5-35B-A3B model card)</w:t>
+            </w:r>
+          </w:p>
+        </w:tc>
+      </w:tr>
+      <w:tr>
+        <w:tc>
+          <w:tcPr>
+            <w:tcW w:w="2285" w:type="dxa"/>
+            <w:tcMar/>
+            <w:vAlign w:val="center"/>
+          </w:tcPr>
+          <w:p>
+            <w:pPr>
+              <w:spacing w:after="0"/>
+            </w:pPr>
+            <w:r>
+              <w:rPr>
+                <w:rFonts w:ascii="Aptos" w:hAnsi="Aptos"/>
+                <w:b w:val="0"/>
+                <w:sz w:val="16"/>
+              </w:rPr>
+              <w:t>Official FullStackBench EN</w:t>
+            </w:r>
+          </w:p>
+        </w:tc>
+        <w:tc>
+          <w:tcPr>
+            <w:tcW w:w="2700" w:type="dxa"/>
+            <w:tcMar/>
+            <w:vAlign w:val="center"/>
+          </w:tcPr>
+          <w:p>
+            <w:pPr>
+              <w:spacing w:after="0"/>
+            </w:pPr>
+            <w:r>
+              <w:rPr>
+                <w:rFonts w:ascii="Aptos" w:hAnsi="Aptos"/>
+                <w:b w:val="0"/>
+                <w:sz w:val="16"/>
+              </w:rPr>
+              <w:t>Not retained in the current 0731 evidence pack</w:t>
+            </w:r>
+          </w:p>
+        </w:tc>
+        <w:tc>
+          <w:tcPr>
+            <w:tcW w:w="3329" w:type="dxa"/>
+            <w:tcMar/>
+            <w:vAlign w:val="center"/>
+          </w:tcPr>
+          <w:p>
+            <w:pPr>
+              <w:spacing w:after="0"/>
+            </w:pPr>
+            <w:r>
+              <w:rPr>
+                <w:rFonts w:ascii="Aptos" w:hAnsi="Aptos"/>
+                <w:b w:val="0"/>
+                <w:sz w:val="16"/>
+              </w:rPr>
               <w:t>58.1 (Qwen3.5-35B-A3B model card)</w:t>
+            </w:r>
+          </w:p>
+        </w:tc>
+      </w:tr>
+      <w:tr>
+        <w:tc>
+          <w:tcPr>
+            <w:tcW w:w="2285" w:type="dxa"/>
+            <w:tcMar/>
+            <w:vAlign w:val="center"/>
+          </w:tcPr>
+          <w:p>
+            <w:pPr>
+              <w:spacing w:after="0"/>
+            </w:pPr>
+            <w:r>
+              <w:rPr>
+                <w:rFonts w:ascii="Aptos" w:hAnsi="Aptos"/>
+                <w:b w:val="0"/>
+                <w:sz w:val="16"/>
+              </w:rPr>
+              <w:t>Artificial Analysis Intelligence Index</w:t>
+            </w:r>
+          </w:p>
+        </w:tc>
+        <w:tc>
+          <w:tcPr>
+            <w:tcW w:w="2700" w:type="dxa"/>
+            <w:tcMar/>
+            <w:vAlign w:val="center"/>
+          </w:tcPr>
+          <w:p>
+            <w:pPr>
+              <w:spacing w:after="0"/>
+            </w:pPr>
+            <w:r>
+              <w:rPr>
+                <w:rFonts w:ascii="Aptos" w:hAnsi="Aptos"/>
+                <w:b w:val="0"/>
+                <w:sz w:val="16"/>
+              </w:rPr>
+              <w:t>51.77 (displayed as 52), v4.1.1</w:t>
+            </w:r>
+          </w:p>
+        </w:tc>
+        <w:tc>
+          <w:tcPr>
+            <w:tcW w:w="3329" w:type="dxa"/>
+            <w:tcMar/>
+            <w:vAlign w:val="center"/>
+          </w:tcPr>
+          <w:p>
+            <w:pPr>
+              <w:spacing w:after="0"/>
+            </w:pPr>
+            <w:r>
+              <w:rPr>
+                <w:rFonts w:ascii="Aptos" w:hAnsi="Aptos"/>
+                <w:b w:val="0"/>
+                <w:sz w:val="16"/>
+              </w:rPr>
+              <w:t>Not independently verified in this review</w:t>
+            </w:r>
+          </w:p>
+        </w:tc>
+      </w:tr>
+      <w:tr>
+        <w:tc>
+          <w:tcPr>
+            <w:tcW w:w="2285" w:type="dxa"/>
+            <w:tcMar/>
+            <w:vAlign w:val="center"/>
+          </w:tcPr>
+          <w:p>
+            <w:pPr>
+              <w:spacing w:after="0"/>
+            </w:pPr>
+            <w:r>
+              <w:rPr>
+                <w:rFonts w:ascii="Aptos" w:hAnsi="Aptos"/>
+                <w:b w:val="0"/>
+                <w:sz w:val="16"/>
+              </w:rPr>
+              <w:t>Artificial Analysis Agentic Index</w:t>
+            </w:r>
+          </w:p>
+        </w:tc>
+        <w:tc>
+          <w:tcPr>
+            <w:tcW w:w="2700" w:type="dxa"/>
+            <w:tcMar/>
+            <w:vAlign w:val="center"/>
+          </w:tcPr>
+          <w:p>
+            <w:pPr>
+              <w:spacing w:after="0"/>
+            </w:pPr>
+            <w:r>
+              <w:rPr>
+                <w:rFonts w:ascii="Aptos" w:hAnsi="Aptos"/>
+                <w:b w:val="0"/>
+                <w:sz w:val="16"/>
+              </w:rPr>
+              <w:t>48.41</w:t>
+            </w:r>
+          </w:p>
+        </w:tc>
+        <w:tc>
+          <w:tcPr>
+            <w:tcW w:w="3329" w:type="dxa"/>
+            <w:tcMar/>
+            <w:vAlign w:val="center"/>
+          </w:tcPr>
+          <w:p>
+            <w:pPr>
+              <w:spacing w:after="0"/>
+            </w:pPr>
+            <w:r>
+              <w:rPr>
+                <w:rFonts w:ascii="Aptos" w:hAnsi="Aptos"/>
+                <w:b w:val="0"/>
+                <w:sz w:val="16"/>
+              </w:rPr>
+              <w:t>Not independently verified in this review</w:t>
+            </w:r>
+          </w:p>
+        </w:tc>
+      </w:tr>
+      <w:tr>
+        <w:tc>
+          <w:tcPr>
+            <w:tcW w:w="2285" w:type="dxa"/>
+            <w:tcMar/>
+            <w:vAlign w:val="center"/>
+          </w:tcPr>
+          <w:p>
+            <w:pPr>
+              <w:spacing w:after="0"/>
+            </w:pPr>
+            <w:r>
+              <w:rPr>
+                <w:rFonts w:ascii="Aptos" w:hAnsi="Aptos"/>
+                <w:b w:val="0"/>
+                <w:sz w:val="16"/>
+              </w:rPr>
+              <w:t>Independent Terminal-Bench v2.1</w:t>
+            </w:r>
+          </w:p>
+        </w:tc>
+        <w:tc>
+          <w:tcPr>
+            <w:tcW w:w="2700" w:type="dxa"/>
+            <w:tcMar/>
+            <w:vAlign w:val="center"/>
+          </w:tcPr>
+          <w:p>
+            <w:pPr>
+              <w:spacing w:after="0"/>
+            </w:pPr>
+            <w:r>
+              <w:rPr>
+                <w:rFonts w:ascii="Aptos" w:hAnsi="Aptos"/>
+                <w:b w:val="0"/>
+                <w:sz w:val="16"/>
+              </w:rPr>
+              <w:t>78.65% (Artificial Analysis)</w:t>
+            </w:r>
+          </w:p>
+        </w:tc>
+        <w:tc>
+          <w:tcPr>
+            <w:tcW w:w="3329" w:type="dxa"/>
+            <w:tcMar/>
+            <w:vAlign w:val="center"/>
+          </w:tcPr>
+          <w:p>
+            <w:pPr>
+              <w:spacing w:after="0"/>
+            </w:pPr>
+            <w:r>
+              <w:rPr>
+                <w:rFonts w:ascii="Aptos" w:hAnsi="Aptos"/>
+                <w:b w:val="0"/>
+                <w:sz w:val="16"/>
+              </w:rPr>
+              <w:t>Not independently verified in this review</w:t>
+            </w:r>
+          </w:p>
+        </w:tc>
+      </w:tr>
+      <w:tr>
+        <w:tc>
+          <w:tcPr>
+            <w:tcW w:w="2285" w:type="dxa"/>
+            <w:tcMar/>
+            <w:vAlign w:val="center"/>
+          </w:tcPr>
+          <w:p>
+            <w:pPr>
+              <w:spacing w:after="0"/>
+            </w:pPr>
+            <w:r>
+              <w:rPr>
+                <w:rFonts w:ascii="Aptos" w:hAnsi="Aptos"/>
+                <w:b w:val="0"/>
+                <w:sz w:val="16"/>
+              </w:rPr>
+              <w:t>Independent native-endpoint speed</w:t>
+            </w:r>
+          </w:p>
+        </w:tc>
+        <w:tc>
+          <w:tcPr>
+            <w:tcW w:w="2700" w:type="dxa"/>
+            <w:tcMar/>
+            <w:vAlign w:val="center"/>
+          </w:tcPr>
+          <w:p>
+            <w:pPr>
+              <w:spacing w:after="0"/>
+            </w:pPr>
+            <w:r>
+              <w:rPr>
+                <w:rFonts w:ascii="Aptos" w:hAnsi="Aptos"/>
+                <w:b w:val="0"/>
+                <w:sz w:val="16"/>
+              </w:rPr>
+              <w:t>103.17 output tokens/s median; TTFC 1.18 s (Artificial Analysis)</w:t>
+            </w:r>
+          </w:p>
+        </w:tc>
+        <w:tc>
+          <w:tcPr>
+            <w:tcW w:w="3329" w:type="dxa"/>
+            <w:tcMar/>
+            <w:vAlign w:val="center"/>
+          </w:tcPr>
+          <w:p>
+            <w:pPr>
+              <w:spacing w:after="0"/>
+            </w:pPr>
+            <w:r>
+              <w:rPr>
+                <w:rFonts w:ascii="Aptos" w:hAnsi="Aptos"/>
+                <w:b w:val="0"/>
+                <w:sz w:val="16"/>
+              </w:rPr>
+              <w:t>Not independently verified in this review</w:t>
             </w:r>
           </w:p>
         </w:tc>
@@ -6883,7 +7193,7 @@
         <w:t xml:space="preserve">Interpretation rule: </w:t>
       </w:r>
       <w:r>
-        <w:t>official publisher benchmark values provide capability context only. They were not produced by one shared harness and therefore do not replace the controlled 55-point app test.</w:t>
+        <w:t>publisher and independent benchmark values provide capability context only. They were not produced by one shared harness and therefore do not replace the controlled 55-point app test.</w:t>
       </w:r>
     </w:p>
     <w:p>
@@ -7269,7 +7579,7 @@
                 <w:b w:val="0"/>
                 <w:sz w:val="17"/>
               </w:rPr>
-              <w:t>Multiple publisher coding benchmarks; no shared independent harness</w:t>
+              <w:t>Publisher and independent coding evidence retained; harnesses are not shared</w:t>
             </w:r>
           </w:p>
         </w:tc>
@@ -7331,7 +7641,7 @@
                 <w:b w:val="0"/>
                 <w:sz w:val="17"/>
               </w:rPr>
-              <w:t>0</w:t>
+              <w:t>1.5</w:t>
             </w:r>
           </w:p>
         </w:tc>
@@ -7350,7 +7660,7 @@
                 <w:b w:val="0"/>
                 <w:sz w:val="17"/>
               </w:rPr>
-              <w:t>No matched native-endpoint P50/P95 latency or throughput evidence retained</w:t>
+              <w:t>Independent median output speed and TTFC retained; no matched Qwen endpoint run</w:t>
             </w:r>
           </w:p>
         </w:tc>
@@ -7497,7 +7807,7 @@
                 <w:b w:val="0"/>
                 <w:sz w:val="17"/>
               </w:rPr>
-              <w:t>11</w:t>
+              <w:t>12.5</w:t>
             </w:r>
           </w:p>
         </w:tc>
@@ -8293,7 +8603,7 @@
                 <w:b w:val="0"/>
                 <w:sz w:val="17"/>
               </w:rPr>
-              <w:t>18/18 — all 8 checks passed; normalized from 8/8 to category maximum</w:t>
+              <w:t>No final score — 6/7 functional checks passed; startup and Run 2 missing; confirmed lower bound 15.43/18</w:t>
             </w:r>
           </w:p>
         </w:tc>
@@ -8375,7 +8685,7 @@
                 <w:b w:val="0"/>
                 <w:sz w:val="17"/>
               </w:rPr>
-              <w:t>8/8 — recorded tests and console/error checks passed</w:t>
+              <w:t>No final score — current evidence supports a 6–8/8 range; Shooter Run 2 missing</w:t>
             </w:r>
           </w:p>
         </w:tc>
@@ -8459,7 +8769,7 @@
                 <w:b w:val="0"/>
                 <w:sz w:val="17"/>
               </w:rPr>
-              <w:t>Not comparable — To-Do median 30.5 min; Shooter has one 12 min run</w:t>
+              <w:t>Not comparable — To-Do audit-log median 30:53; Shooter has one 12 min run</w:t>
             </w:r>
           </w:p>
         </w:tc>
@@ -8707,7 +9017,7 @@
                 <w:b w:val="0"/>
                 <w:sz w:val="17"/>
               </w:rPr>
-              <w:t>44/44 evidenced; 11 points remain unscorable</w:t>
+              <w:t>18/18 confirmed for To-Do only; no final /55 score</w:t>
             </w:r>
           </w:p>
         </w:tc>
@@ -9887,7 +10197,7 @@
                 <w:b w:val="0"/>
                 <w:sz w:val="17"/>
               </w:rPr>
-              <w:t>2 To-Do + 1 Shooter run; Shooter Run 2 missing</w:t>
+              <w:t>To-Do complete; Shooter startup and Run 2 missing</w:t>
             </w:r>
           </w:p>
         </w:tc>
@@ -10248,7 +10558,7 @@
                 <w:b w:val="0"/>
                 <w:sz w:val="17"/>
               </w:rPr>
-              <w:t>11/15 evidence completeness</w:t>
+              <w:t>12.5/15 evidence completeness</w:t>
             </w:r>
           </w:p>
         </w:tc>
@@ -10336,7 +10646,7 @@
                 <w:b w:val="0"/>
                 <w:sz w:val="17"/>
               </w:rPr>
-              <w:t>44/44 evidenced; 11 unscorable</w:t>
+              <w:t>To-Do 18/18 only; no final /55</w:t>
             </w:r>
           </w:p>
         </w:tc>
@@ -10596,7 +10906,7 @@
                 <w:b w:val="0"/>
                 <w:sz w:val="17"/>
               </w:rPr>
-              <w:t>Provisional for supplied checks; evidence set incomplete</w:t>
+              <w:t>Not established</w:t>
             </w:r>
           </w:p>
         </w:tc>
@@ -10628,8 +10938,16 @@
       </w:pPr>
     </w:p>
     <w:p>
+      <w:pPr>
+        <w:pStyle w:val="Heading1"/>
+      </w:pPr>
       <w:r>
-        <w:br w:type="page"/>
+        <w:t>5. Evidence-Based Decision Gate</w:t>
+      </w:r>
+    </w:p>
+    <w:p>
+      <w:r>
+        <w:t>Do not calculate an overall score or select a winner until: (1) Qwen completes the same two runs per app; (2) DeepSeek Shooter startup and Run 2 are recorded; (3) native usage fields support measured cost; and (4) blinded human evaluation is complete for both models.</w:t>
       </w:r>
     </w:p>
     <w:p>
@@ -10831,7 +11149,7 @@
                 <w:b w:val="0"/>
                 <w:sz w:val="17"/>
               </w:rPr>
-              <w:t>DeepSeek V4 Flash passed the supplied shooter checks; Qwen scorable evidence and DeepSeek Shooter Run 2 are missing.</w:t>
+              <w:t>No comparison. DeepSeek passed 6/7 recorded functional checks plus tests/console, but startup and Run 2 are missing; Qwen scorable evidence is absent.</w:t>
             </w:r>
           </w:p>
         </w:tc>
@@ -10876,7 +11194,7 @@
                 <w:b w:val="0"/>
                 <w:sz w:val="17"/>
               </w:rPr>
-              <w:t>Not comparable. DeepSeek To-Do median was 30.5 minutes and one Shooter run was 12 minutes; no Qwen timing exists.</w:t>
+              <w:t>Not comparable. DeepSeek To-Do audit-log median was 30:53 and one Shooter run was 12 minutes; no Qwen timing exists.</w:t>
             </w:r>
           </w:p>
         </w:tc>
@@ -11007,7 +11325,7 @@
                 <w:b w:val="0"/>
                 <w:sz w:val="17"/>
               </w:rPr>
-              <w:t>Missing matched Qwen runs, incomplete DeepSeek Shooter repetition, incomplete usage fields and no human-evaluation evidence.</w:t>
+              <w:t>Missing matched Qwen runs; missing DeepSeek Shooter startup and Run 2; incomplete usage fields; and no human-evaluation evidence.</w:t>
             </w:r>
           </w:p>
         </w:tc>
@@ -11137,6 +11455,16 @@
     <w:p>
       <w:r>
         <w:t>[11] Alibaba Cloud Model Studio, context cache billing (explicit/implicit creation and hit rates). https://help.aliyun.com/zh/model-studio/context-cache (accessed 2026-08-19)</w:t>
+      </w:r>
+    </w:p>
+    <w:p>
+      <w:r>
+        <w:t>[12] Artificial Analysis, DeepSeek V4 Flash model results. https://artificialanalysis.ai/models/deepseek-v4-flash (accessed 2026-08-19)</w:t>
+      </w:r>
+    </w:p>
+    <w:p>
+      <w:r>
+        <w:t>[13] Artificial Analysis, intelligence benchmarking methodology. https://artificialanalysis.ai/methodology/intelligence-benchmarking (accessed 2026-08-19)</w:t>
       </w:r>
     </w:p>
     <w:p>
@@ -11747,11 +12075,11 @@
             </w:pPr>
             <w:r>
               <w:rPr>
-                <w:rFonts w:eastAsia="Aptos" w:cs="Aptos"/>
-                <w:sz w:val="13"/>
-                <w:szCs w:val="13"/>
-              </w:rPr>
-              <w:t>30mins</w:t>
+                <w:rFonts w:ascii="Aptos" w:hAnsi="Aptos"/>
+                <w:b w:val="0"/>
+                <w:sz w:val="17"/>
+              </w:rPr>
+              <w:t>30:06</w:t>
             </w:r>
           </w:p>
         </w:tc>
@@ -12060,19 +12388,14 @@
           <w:p>
             <w:pPr>
               <w:spacing w:after="0"/>
-              <w:rPr>
-                <w:rFonts w:eastAsia="Aptos" w:cs="Aptos"/>
-                <w:sz w:val="13"/>
-                <w:szCs w:val="13"/>
-              </w:rPr>
-            </w:pPr>
-            <w:r>
-              <w:rPr>
-                <w:rFonts w:eastAsia="Aptos" w:cs="Aptos"/>
-                <w:sz w:val="13"/>
-                <w:szCs w:val="13"/>
-              </w:rPr>
-              <w:t>31mins</w:t>
+            </w:pPr>
+            <w:r>
+              <w:rPr>
+                <w:rFonts w:ascii="Aptos" w:hAnsi="Aptos"/>
+                <w:b w:val="0"/>
+                <w:sz w:val="17"/>
+              </w:rPr>
+              <w:t>31:40</w:t>
             </w:r>
           </w:p>
         </w:tc>
@@ -13511,7 +13834,7 @@
         <w:spacing w:before="60" w:after="60"/>
       </w:pPr>
       <w:r>
-        <w:t>— = evidence not supplied. * Measured cost is not calculable from an aggregate token total. Capture input, output, cache-read, cache-write and any separately billed reasoning fields from the provider usage response.</w:t>
+        <w:t>— = evidence not supplied. To-Do times use the exact audit log; the source summary rounded them to 30 and 31 minutes. * Measured cost is not calculable from an aggregate token total. Capture input, output, cache-read, cache-write and any separately billed reasoning fields from the provider usage response.</w:t>
       </w:r>
     </w:p>
     <w:p>

</xml_diff>